<commit_message>
doc: fix the project report
</commit_message>
<xml_diff>
--- a/smart-farm/report/Smart_Farm_Simulator_Report.docx
+++ b/smart-farm/report/Smart_Farm_Simulator_Report.docx
@@ -2301,12 +2301,12 @@
           <wp:inline distB="114300" distT="114300" distL="114300" distR="114300">
             <wp:extent cx="5486400" cy="5194300"/>
             <wp:effectExtent b="0" l="0" r="0" t="0"/>
-            <wp:docPr id="9" name="image4.png"/>
+            <wp:docPr id="10" name="image5.png"/>
             <a:graphic>
               <a:graphicData uri="http://schemas.openxmlformats.org/drawingml/2006/picture">
                 <pic:pic>
                   <pic:nvPicPr>
-                    <pic:cNvPr id="0" name="image4.png"/>
+                    <pic:cNvPr id="0" name="image5.png"/>
                     <pic:cNvPicPr preferRelativeResize="0"/>
                   </pic:nvPicPr>
                   <pic:blipFill>
@@ -4539,12 +4539,12 @@
           <wp:inline distB="114300" distT="114300" distL="114300" distR="114300">
             <wp:extent cx="5486400" cy="2743200"/>
             <wp:effectExtent b="0" l="0" r="0" t="0"/>
-            <wp:docPr id="6" name="image2.png"/>
+            <wp:docPr id="7" name="image3.png"/>
             <a:graphic>
               <a:graphicData uri="http://schemas.openxmlformats.org/drawingml/2006/picture">
                 <pic:pic>
                   <pic:nvPicPr>
-                    <pic:cNvPr id="0" name="image2.png"/>
+                    <pic:cNvPr id="0" name="image3.png"/>
                     <pic:cNvPicPr preferRelativeResize="0"/>
                   </pic:nvPicPr>
                   <pic:blipFill>
@@ -5486,11 +5486,39 @@
           <w:color w:val="555555"/>
           <w:sz w:val="20"/>
           <w:szCs w:val="20"/>
-          <w:rtl w:val="0"/>
-        </w:rPr>
-        <w:t xml:space="preserve">[ INSERT IMAGE: Core package class diagram ]</w:t>
-        <w:br w:type="textWrapping"/>
-        <w:t xml:space="preserve">→ exported PNG file: design/core-class-diagram.png</w:t>
+        </w:rPr>
+        <w:drawing>
+          <wp:inline distB="114300" distT="114300" distL="114300" distR="114300">
+            <wp:extent cx="5486400" cy="6464300"/>
+            <wp:effectExtent b="0" l="0" r="0" t="0"/>
+            <wp:docPr id="6" name="image9.png"/>
+            <a:graphic>
+              <a:graphicData uri="http://schemas.openxmlformats.org/drawingml/2006/picture">
+                <pic:pic>
+                  <pic:nvPicPr>
+                    <pic:cNvPr id="0" name="image9.png"/>
+                    <pic:cNvPicPr preferRelativeResize="0"/>
+                  </pic:nvPicPr>
+                  <pic:blipFill>
+                    <a:blip r:embed="rId9"/>
+                    <a:srcRect b="0" l="0" r="0" t="0"/>
+                    <a:stretch>
+                      <a:fillRect/>
+                    </a:stretch>
+                  </pic:blipFill>
+                  <pic:spPr>
+                    <a:xfrm>
+                      <a:off x="0" y="0"/>
+                      <a:ext cx="5486400" cy="6464300"/>
+                    </a:xfrm>
+                    <a:prstGeom prst="rect"/>
+                    <a:ln/>
+                  </pic:spPr>
+                </pic:pic>
+              </a:graphicData>
+            </a:graphic>
+          </wp:inline>
+        </w:drawing>
       </w:r>
       <w:r>
         <w:rPr>
@@ -6096,16 +6124,16 @@
           <wp:inline distB="114300" distT="114300" distL="114300" distR="114300">
             <wp:extent cx="5481638" cy="3429271"/>
             <wp:effectExtent b="0" l="0" r="0" t="0"/>
-            <wp:docPr id="1" name="image1.png"/>
+            <wp:docPr id="1" name="image2.png"/>
             <a:graphic>
               <a:graphicData uri="http://schemas.openxmlformats.org/drawingml/2006/picture">
                 <pic:pic>
                   <pic:nvPicPr>
-                    <pic:cNvPr id="0" name="image1.png"/>
+                    <pic:cNvPr id="0" name="image2.png"/>
                     <pic:cNvPicPr preferRelativeResize="0"/>
                   </pic:nvPicPr>
                   <pic:blipFill>
-                    <a:blip r:embed="rId9"/>
+                    <a:blip r:embed="rId10"/>
                     <a:srcRect b="0" l="0" r="0" t="0"/>
                     <a:stretch>
                       <a:fillRect/>
@@ -6424,16 +6452,16 @@
           <wp:inline distB="114300" distT="114300" distL="114300" distR="114300">
             <wp:extent cx="5486400" cy="2514600"/>
             <wp:effectExtent b="0" l="0" r="0" t="0"/>
-            <wp:docPr id="5" name="image7.png"/>
+            <wp:docPr id="5" name="image10.png"/>
             <a:graphic>
               <a:graphicData uri="http://schemas.openxmlformats.org/drawingml/2006/picture">
                 <pic:pic>
                   <pic:nvPicPr>
-                    <pic:cNvPr id="0" name="image7.png"/>
+                    <pic:cNvPr id="0" name="image10.png"/>
                     <pic:cNvPicPr preferRelativeResize="0"/>
                   </pic:nvPicPr>
                   <pic:blipFill>
-                    <a:blip r:embed="rId10"/>
+                    <a:blip r:embed="rId11"/>
                     <a:srcRect b="0" l="0" r="0" t="0"/>
                     <a:stretch>
                       <a:fillRect/>
@@ -8685,16 +8713,16 @@
           <wp:inline distB="114300" distT="114300" distL="114300" distR="114300">
             <wp:extent cx="5486400" cy="3022600"/>
             <wp:effectExtent b="0" l="0" r="0" t="0"/>
-            <wp:docPr id="7" name="image6.png"/>
+            <wp:docPr id="8" name="image8.png"/>
             <a:graphic>
               <a:graphicData uri="http://schemas.openxmlformats.org/drawingml/2006/picture">
                 <pic:pic>
                   <pic:nvPicPr>
-                    <pic:cNvPr id="0" name="image6.png"/>
+                    <pic:cNvPr id="0" name="image8.png"/>
                     <pic:cNvPicPr preferRelativeResize="0"/>
                   </pic:nvPicPr>
                   <pic:blipFill>
-                    <a:blip r:embed="rId11"/>
+                    <a:blip r:embed="rId12"/>
                     <a:srcRect b="0" l="0" r="0" t="0"/>
                     <a:stretch>
                       <a:fillRect/>
@@ -9220,16 +9248,16 @@
           <wp:inline distB="114300" distT="114300" distL="114300" distR="114300">
             <wp:extent cx="5486400" cy="2006600"/>
             <wp:effectExtent b="0" l="0" r="0" t="0"/>
-            <wp:docPr id="8" name="image8.png"/>
+            <wp:docPr id="9" name="image6.png"/>
             <a:graphic>
               <a:graphicData uri="http://schemas.openxmlformats.org/drawingml/2006/picture">
                 <pic:pic>
                   <pic:nvPicPr>
-                    <pic:cNvPr id="0" name="image8.png"/>
+                    <pic:cNvPr id="0" name="image6.png"/>
                     <pic:cNvPicPr preferRelativeResize="0"/>
                   </pic:nvPicPr>
                   <pic:blipFill>
-                    <a:blip r:embed="rId12"/>
+                    <a:blip r:embed="rId13"/>
                     <a:srcRect b="0" l="0" r="0" t="0"/>
                     <a:stretch>
                       <a:fillRect/>
@@ -9268,16 +9296,16 @@
           <wp:inline distB="114300" distT="114300" distL="114300" distR="114300">
             <wp:extent cx="5486400" cy="3759200"/>
             <wp:effectExtent b="0" l="0" r="0" t="0"/>
-            <wp:docPr id="3" name="image3.png"/>
+            <wp:docPr id="3" name="image1.png"/>
             <a:graphic>
               <a:graphicData uri="http://schemas.openxmlformats.org/drawingml/2006/picture">
                 <pic:pic>
                   <pic:nvPicPr>
-                    <pic:cNvPr id="0" name="image3.png"/>
+                    <pic:cNvPr id="0" name="image1.png"/>
                     <pic:cNvPicPr preferRelativeResize="0"/>
                   </pic:nvPicPr>
                   <pic:blipFill>
-                    <a:blip r:embed="rId13"/>
+                    <a:blip r:embed="rId14"/>
                     <a:srcRect b="0" l="0" r="0" t="0"/>
                     <a:stretch>
                       <a:fillRect/>
@@ -9632,16 +9660,16 @@
           <wp:inline distB="114300" distT="114300" distL="114300" distR="114300">
             <wp:extent cx="5486400" cy="3060700"/>
             <wp:effectExtent b="0" l="0" r="0" t="0"/>
-            <wp:docPr id="2" name="image5.png"/>
+            <wp:docPr id="2" name="image7.png"/>
             <a:graphic>
               <a:graphicData uri="http://schemas.openxmlformats.org/drawingml/2006/picture">
                 <pic:pic>
                   <pic:nvPicPr>
-                    <pic:cNvPr id="0" name="image5.png"/>
+                    <pic:cNvPr id="0" name="image7.png"/>
                     <pic:cNvPicPr preferRelativeResize="0"/>
                   </pic:nvPicPr>
                   <pic:blipFill>
-                    <a:blip r:embed="rId14"/>
+                    <a:blip r:embed="rId15"/>
                     <a:srcRect b="0" l="0" r="0" t="0"/>
                     <a:stretch>
                       <a:fillRect/>
@@ -9680,16 +9708,16 @@
           <wp:inline distB="114300" distT="114300" distL="114300" distR="114300">
             <wp:extent cx="5486400" cy="2514600"/>
             <wp:effectExtent b="0" l="0" r="0" t="0"/>
-            <wp:docPr id="4" name="image9.png"/>
+            <wp:docPr id="4" name="image4.png"/>
             <a:graphic>
               <a:graphicData uri="http://schemas.openxmlformats.org/drawingml/2006/picture">
                 <pic:pic>
                   <pic:nvPicPr>
-                    <pic:cNvPr id="0" name="image9.png"/>
+                    <pic:cNvPr id="0" name="image4.png"/>
                     <pic:cNvPicPr preferRelativeResize="0"/>
                   </pic:nvPicPr>
                   <pic:blipFill>
-                    <a:blip r:embed="rId15"/>
+                    <a:blip r:embed="rId16"/>
                     <a:srcRect b="0" l="0" r="0" t="0"/>
                     <a:stretch>
                       <a:fillRect/>

</xml_diff>